<commit_message>
Installed sqlalchemy in venv
</commit_message>
<xml_diff>
--- a/Fast_API.docx
+++ b/Fast_API.docx
@@ -413,6 +413,7 @@
         <w:t xml:space="preserve">app = </w:t>
       </w:r>
       <w:proofErr w:type="spellStart"/>
+      <w:proofErr w:type="gramStart"/>
       <w:r>
         <w:rPr>
           <w:sz w:val="24"/>
@@ -428,9 +429,19 @@
           <w:szCs w:val="24"/>
           <w:highlight w:val="green"/>
         </w:rPr>
-        <w:t xml:space="preserve">() //here, we create </w:t>
+        <w:t>(</w:t>
+      </w:r>
+      <w:proofErr w:type="gramEnd"/>
+      <w:r>
+        <w:rPr>
+          <w:sz w:val="24"/>
+          <w:szCs w:val="24"/>
+          <w:highlight w:val="green"/>
+        </w:rPr>
+        <w:t xml:space="preserve">) //here, we create </w:t>
       </w:r>
       <w:proofErr w:type="spellStart"/>
+      <w:proofErr w:type="gramStart"/>
       <w:r>
         <w:rPr>
           <w:sz w:val="24"/>
@@ -440,6 +451,7 @@
         <w:t>a</w:t>
       </w:r>
       <w:proofErr w:type="spellEnd"/>
+      <w:proofErr w:type="gramEnd"/>
       <w:r>
         <w:rPr>
           <w:sz w:val="24"/>
@@ -1762,7 +1774,23 @@
           <w:sz w:val="24"/>
           <w:szCs w:val="24"/>
         </w:rPr>
-        <w:t xml:space="preserve"> given any path parameter, it will finds out simply that it i</w:t>
+        <w:t xml:space="preserve"> given any path parameter, it will </w:t>
+      </w:r>
+      <w:proofErr w:type="gramStart"/>
+      <w:r>
+        <w:rPr>
+          <w:sz w:val="24"/>
+          <w:szCs w:val="24"/>
+        </w:rPr>
+        <w:t>finds</w:t>
+      </w:r>
+      <w:proofErr w:type="gramEnd"/>
+      <w:r>
+        <w:rPr>
+          <w:sz w:val="24"/>
+          <w:szCs w:val="24"/>
+        </w:rPr>
+        <w:t xml:space="preserve"> out simply that it i</w:t>
       </w:r>
       <w:r>
         <w:rPr>
@@ -1791,7 +1819,23 @@
           <w:sz w:val="24"/>
           <w:szCs w:val="24"/>
         </w:rPr>
-        <w:t xml:space="preserve">query parameters are key-value pairs appended after the ? in a URL (e.g., /items/?skip=0&amp;limit=10) used primarily for filtering, sorting, or paginating data. Any function argument in your path operation that is </w:t>
+        <w:t xml:space="preserve">query parameters are key-value pairs appended after </w:t>
+      </w:r>
+      <w:proofErr w:type="gramStart"/>
+      <w:r>
+        <w:rPr>
+          <w:sz w:val="24"/>
+          <w:szCs w:val="24"/>
+        </w:rPr>
+        <w:t>the ?</w:t>
+      </w:r>
+      <w:proofErr w:type="gramEnd"/>
+      <w:r>
+        <w:rPr>
+          <w:sz w:val="24"/>
+          <w:szCs w:val="24"/>
+        </w:rPr>
+        <w:t xml:space="preserve"> in a URL (e.g., /items/?skip=0&amp;limit=10) used primarily for filtering, sorting, or paginating data. Any function argument in your path operation that is </w:t>
       </w:r>
       <w:r>
         <w:rPr>
@@ -1939,7 +1983,39 @@
           <w:sz w:val="24"/>
           <w:szCs w:val="24"/>
         </w:rPr>
-        <w:t>If we have add a query parameter means ?&lt;name&gt; after greet and observe the output.</w:t>
+        <w:t xml:space="preserve">If we have </w:t>
+      </w:r>
+      <w:proofErr w:type="gramStart"/>
+      <w:r>
+        <w:rPr>
+          <w:sz w:val="24"/>
+          <w:szCs w:val="24"/>
+        </w:rPr>
+        <w:t>add</w:t>
+      </w:r>
+      <w:proofErr w:type="gramEnd"/>
+      <w:r>
+        <w:rPr>
+          <w:sz w:val="24"/>
+          <w:szCs w:val="24"/>
+        </w:rPr>
+        <w:t xml:space="preserve"> a query parameter </w:t>
+      </w:r>
+      <w:proofErr w:type="gramStart"/>
+      <w:r>
+        <w:rPr>
+          <w:sz w:val="24"/>
+          <w:szCs w:val="24"/>
+        </w:rPr>
+        <w:t>means ?</w:t>
+      </w:r>
+      <w:proofErr w:type="gramEnd"/>
+      <w:r>
+        <w:rPr>
+          <w:sz w:val="24"/>
+          <w:szCs w:val="24"/>
+        </w:rPr>
+        <w:t>&lt;name&gt; after greet and observe the output.</w:t>
       </w:r>
     </w:p>
     <w:p>
@@ -2301,7 +2377,15 @@
           <w:sz w:val="24"/>
           <w:szCs w:val="24"/>
         </w:rPr>
-        <w:t>get_user</w:t>
+        <w:t>get_</w:t>
+      </w:r>
+      <w:proofErr w:type="gramStart"/>
+      <w:r>
+        <w:rPr>
+          <w:sz w:val="24"/>
+          <w:szCs w:val="24"/>
+        </w:rPr>
+        <w:t>user</w:t>
       </w:r>
       <w:proofErr w:type="spellEnd"/>
       <w:r>
@@ -2312,6 +2396,7 @@
         <w:t>(</w:t>
       </w:r>
       <w:proofErr w:type="spellStart"/>
+      <w:proofErr w:type="gramEnd"/>
       <w:r>
         <w:rPr>
           <w:sz w:val="24"/>
@@ -2639,12 +2724,21 @@
         <w:t>/</w:t>
       </w:r>
       <w:proofErr w:type="spellStart"/>
-      <w:r>
-        <w:rPr>
-          <w:sz w:val="24"/>
-          <w:szCs w:val="24"/>
-        </w:rPr>
-        <w:t>users?age</w:t>
+      <w:proofErr w:type="gramStart"/>
+      <w:r>
+        <w:rPr>
+          <w:sz w:val="24"/>
+          <w:szCs w:val="24"/>
+        </w:rPr>
+        <w:t>users</w:t>
+      </w:r>
+      <w:proofErr w:type="gramEnd"/>
+      <w:r>
+        <w:rPr>
+          <w:sz w:val="24"/>
+          <w:szCs w:val="24"/>
+        </w:rPr>
+        <w:t>?age</w:t>
       </w:r>
       <w:proofErr w:type="spellEnd"/>
       <w:r>
@@ -2670,12 +2764,21 @@
         <w:t>/</w:t>
       </w:r>
       <w:proofErr w:type="spellStart"/>
-      <w:r>
-        <w:rPr>
-          <w:sz w:val="24"/>
-          <w:szCs w:val="24"/>
-        </w:rPr>
-        <w:t>users?city</w:t>
+      <w:proofErr w:type="gramStart"/>
+      <w:r>
+        <w:rPr>
+          <w:sz w:val="24"/>
+          <w:szCs w:val="24"/>
+        </w:rPr>
+        <w:t>users</w:t>
+      </w:r>
+      <w:proofErr w:type="gramEnd"/>
+      <w:r>
+        <w:rPr>
+          <w:sz w:val="24"/>
+          <w:szCs w:val="24"/>
+        </w:rPr>
+        <w:t>?city</w:t>
       </w:r>
       <w:proofErr w:type="spellEnd"/>
       <w:r>
@@ -2701,12 +2804,21 @@
         <w:t>/</w:t>
       </w:r>
       <w:proofErr w:type="spellStart"/>
-      <w:r>
-        <w:rPr>
-          <w:sz w:val="24"/>
-          <w:szCs w:val="24"/>
-        </w:rPr>
-        <w:t>users?sort</w:t>
+      <w:proofErr w:type="gramStart"/>
+      <w:r>
+        <w:rPr>
+          <w:sz w:val="24"/>
+          <w:szCs w:val="24"/>
+        </w:rPr>
+        <w:t>users</w:t>
+      </w:r>
+      <w:proofErr w:type="gramEnd"/>
+      <w:r>
+        <w:rPr>
+          <w:sz w:val="24"/>
+          <w:szCs w:val="24"/>
+        </w:rPr>
+        <w:t>?sort</w:t>
       </w:r>
       <w:proofErr w:type="spellEnd"/>
       <w:r>
@@ -2732,12 +2844,21 @@
         <w:t>/</w:t>
       </w:r>
       <w:proofErr w:type="spellStart"/>
-      <w:r>
-        <w:rPr>
-          <w:sz w:val="24"/>
-          <w:szCs w:val="24"/>
-        </w:rPr>
-        <w:t>users?limit</w:t>
+      <w:proofErr w:type="gramStart"/>
+      <w:r>
+        <w:rPr>
+          <w:sz w:val="24"/>
+          <w:szCs w:val="24"/>
+        </w:rPr>
+        <w:t>users</w:t>
+      </w:r>
+      <w:proofErr w:type="gramEnd"/>
+      <w:r>
+        <w:rPr>
+          <w:sz w:val="24"/>
+          <w:szCs w:val="24"/>
+        </w:rPr>
+        <w:t>?limit</w:t>
       </w:r>
       <w:proofErr w:type="spellEnd"/>
       <w:r>
@@ -2829,7 +2950,15 @@
           <w:sz w:val="24"/>
           <w:szCs w:val="24"/>
         </w:rPr>
-        <w:t>get_users</w:t>
+        <w:t>get_</w:t>
+      </w:r>
+      <w:proofErr w:type="gramStart"/>
+      <w:r>
+        <w:rPr>
+          <w:sz w:val="24"/>
+          <w:szCs w:val="24"/>
+        </w:rPr>
+        <w:t>users</w:t>
       </w:r>
       <w:proofErr w:type="spellEnd"/>
       <w:r>
@@ -2837,7 +2966,15 @@
           <w:sz w:val="24"/>
           <w:szCs w:val="24"/>
         </w:rPr>
-        <w:t>(age: int = None):</w:t>
+        <w:t>(</w:t>
+      </w:r>
+      <w:proofErr w:type="gramEnd"/>
+      <w:r>
+        <w:rPr>
+          <w:sz w:val="24"/>
+          <w:szCs w:val="24"/>
+        </w:rPr>
+        <w:t>age: int = None):</w:t>
       </w:r>
     </w:p>
     <w:p>
@@ -2886,12 +3023,21 @@
         <w:t>/</w:t>
       </w:r>
       <w:proofErr w:type="spellStart"/>
-      <w:r>
-        <w:rPr>
-          <w:sz w:val="24"/>
-          <w:szCs w:val="24"/>
-        </w:rPr>
-        <w:t>users?age</w:t>
+      <w:proofErr w:type="gramStart"/>
+      <w:r>
+        <w:rPr>
+          <w:sz w:val="24"/>
+          <w:szCs w:val="24"/>
+        </w:rPr>
+        <w:t>users</w:t>
+      </w:r>
+      <w:proofErr w:type="gramEnd"/>
+      <w:r>
+        <w:rPr>
+          <w:sz w:val="24"/>
+          <w:szCs w:val="24"/>
+        </w:rPr>
+        <w:t>?age</w:t>
       </w:r>
       <w:proofErr w:type="spellEnd"/>
       <w:r>
@@ -3171,6 +3317,7 @@
                 <w:szCs w:val="24"/>
               </w:rPr>
             </w:pPr>
+            <w:proofErr w:type="gramStart"/>
             <w:r>
               <w:rPr>
                 <w:sz w:val="24"/>
@@ -3178,6 +3325,7 @@
               </w:rPr>
               <w:t>After ?</w:t>
             </w:r>
+            <w:proofErr w:type="gramEnd"/>
           </w:p>
         </w:tc>
       </w:tr>
@@ -3252,12 +3400,21 @@
               <w:t>/</w:t>
             </w:r>
             <w:proofErr w:type="spellStart"/>
+            <w:proofErr w:type="gramStart"/>
             <w:r>
               <w:rPr>
                 <w:sz w:val="24"/>
                 <w:szCs w:val="24"/>
               </w:rPr>
-              <w:t>users?id</w:t>
+              <w:t>users</w:t>
+            </w:r>
+            <w:proofErr w:type="gramEnd"/>
+            <w:r>
+              <w:rPr>
+                <w:sz w:val="24"/>
+                <w:szCs w:val="24"/>
+              </w:rPr>
+              <w:t>?id</w:t>
             </w:r>
             <w:proofErr w:type="spellEnd"/>
             <w:r>
@@ -3341,12 +3498,21 @@
               <w:t>/</w:t>
             </w:r>
             <w:proofErr w:type="spellStart"/>
+            <w:proofErr w:type="gramStart"/>
             <w:r>
               <w:rPr>
                 <w:sz w:val="24"/>
                 <w:szCs w:val="24"/>
               </w:rPr>
-              <w:t>users?id</w:t>
+              <w:t>users</w:t>
+            </w:r>
+            <w:proofErr w:type="gramEnd"/>
+            <w:r>
+              <w:rPr>
+                <w:sz w:val="24"/>
+                <w:szCs w:val="24"/>
+              </w:rPr>
+              <w:t>?id</w:t>
             </w:r>
             <w:proofErr w:type="spellEnd"/>
             <w:r>
@@ -3800,7 +3966,23 @@
           <w:sz w:val="24"/>
           <w:szCs w:val="24"/>
         </w:rPr>
-        <w:t xml:space="preserve">When we use post method, we can send data from client(postman) to server using body(using post or put), </w:t>
+        <w:t xml:space="preserve">When we use post method, we can send data from client(postman) to server using </w:t>
+      </w:r>
+      <w:proofErr w:type="gramStart"/>
+      <w:r>
+        <w:rPr>
+          <w:sz w:val="24"/>
+          <w:szCs w:val="24"/>
+        </w:rPr>
+        <w:t>body(</w:t>
+      </w:r>
+      <w:proofErr w:type="gramEnd"/>
+      <w:r>
+        <w:rPr>
+          <w:sz w:val="24"/>
+          <w:szCs w:val="24"/>
+        </w:rPr>
+        <w:t xml:space="preserve">using post or put), </w:t>
       </w:r>
       <w:r>
         <w:rPr>
@@ -3986,7 +4168,23 @@
           <w:sz w:val="24"/>
           <w:szCs w:val="24"/>
         </w:rPr>
-        <w:t xml:space="preserve">Here, the product that created in Postman using Post method is given as the parameter to the function. The variable body represents { id:3………………….}, variable name can be anything, not only body. </w:t>
+        <w:t xml:space="preserve">Here, the product that created in Postman using Post method is given as the parameter to the function. The variable body represents </w:t>
+      </w:r>
+      <w:proofErr w:type="gramStart"/>
+      <w:r>
+        <w:rPr>
+          <w:sz w:val="24"/>
+          <w:szCs w:val="24"/>
+        </w:rPr>
+        <w:t>{ id</w:t>
+      </w:r>
+      <w:proofErr w:type="gramEnd"/>
+      <w:r>
+        <w:rPr>
+          <w:sz w:val="24"/>
+          <w:szCs w:val="24"/>
+        </w:rPr>
+        <w:t xml:space="preserve">:3………………….}, variable name can be anything, not only body. </w:t>
       </w:r>
       <w:proofErr w:type="spellStart"/>
       <w:r>
@@ -4022,6 +4220,7 @@
         <w:t xml:space="preserve">Now the body = {id :3, </w:t>
       </w:r>
       <w:proofErr w:type="spellStart"/>
+      <w:proofErr w:type="gramStart"/>
       <w:r>
         <w:rPr>
           <w:sz w:val="24"/>
@@ -4030,6 +4229,7 @@
         <w:t>product:mens</w:t>
       </w:r>
       <w:proofErr w:type="spellEnd"/>
+      <w:proofErr w:type="gramEnd"/>
       <w:r>
         <w:rPr>
           <w:sz w:val="24"/>
@@ -4160,6 +4360,7 @@
         </w:rPr>
       </w:pPr>
       <w:proofErr w:type="spellStart"/>
+      <w:proofErr w:type="gramStart"/>
       <w:r>
         <w:rPr>
           <w:sz w:val="24"/>
@@ -4175,6 +4376,7 @@
         <w:t>odel.dump</w:t>
       </w:r>
       <w:proofErr w:type="spellEnd"/>
+      <w:proofErr w:type="gramEnd"/>
       <w:r>
         <w:rPr>
           <w:sz w:val="24"/>
@@ -4465,7 +4667,16 @@
           <w:sz w:val="24"/>
           <w:szCs w:val="24"/>
         </w:rPr>
-        <w:t>──</w:t>
+        <w:t>─</w:t>
+      </w:r>
+      <w:proofErr w:type="gramStart"/>
+      <w:r>
+        <w:rPr>
+          <w:rFonts w:ascii="Calibri" w:hAnsi="Calibri" w:cs="Calibri"/>
+          <w:sz w:val="24"/>
+          <w:szCs w:val="24"/>
+        </w:rPr>
+        <w:t>─</w:t>
       </w:r>
       <w:r>
         <w:rPr>
@@ -4483,6 +4694,7 @@
         <w:t>venv</w:t>
       </w:r>
       <w:proofErr w:type="spellEnd"/>
+      <w:proofErr w:type="gramEnd"/>
       <w:r>
         <w:rPr>
           <w:sz w:val="24"/>
@@ -4742,6 +4954,7 @@
                 <w:szCs w:val="24"/>
               </w:rPr>
             </w:pPr>
+            <w:proofErr w:type="gramStart"/>
             <w:r>
               <w:rPr>
                 <w:sz w:val="24"/>
@@ -4758,6 +4971,7 @@
               <w:t>venv</w:t>
             </w:r>
             <w:proofErr w:type="spellEnd"/>
+            <w:proofErr w:type="gramEnd"/>
             <w:r>
               <w:rPr>
                 <w:sz w:val="24"/>
@@ -5072,6 +5286,55 @@
           <w:szCs w:val="24"/>
         </w:rPr>
       </w:pPr>
+    </w:p>
+    <w:p>
+      <w:pPr>
+        <w:rPr>
+          <w:sz w:val="24"/>
+          <w:szCs w:val="24"/>
+        </w:rPr>
+      </w:pPr>
+      <w:r>
+        <w:rPr>
+          <w:sz w:val="24"/>
+          <w:szCs w:val="24"/>
+        </w:rPr>
+        <w:drawing>
+          <wp:inline distT="0" distB="0" distL="0" distR="0" wp14:anchorId="23804976" wp14:editId="15CBDB55">
+            <wp:extent cx="5731510" cy="1698625"/>
+            <wp:effectExtent l="0" t="0" r="2540" b="0"/>
+            <wp:docPr id="487347614" name="Picture 1"/>
+            <wp:cNvGraphicFramePr>
+              <a:graphicFrameLocks xmlns:a="http://schemas.openxmlformats.org/drawingml/2006/main" noChangeAspect="1"/>
+            </wp:cNvGraphicFramePr>
+            <a:graphic xmlns:a="http://schemas.openxmlformats.org/drawingml/2006/main">
+              <a:graphicData uri="http://schemas.openxmlformats.org/drawingml/2006/picture">
+                <pic:pic xmlns:pic="http://schemas.openxmlformats.org/drawingml/2006/picture">
+                  <pic:nvPicPr>
+                    <pic:cNvPr id="487347614" name=""/>
+                    <pic:cNvPicPr/>
+                  </pic:nvPicPr>
+                  <pic:blipFill>
+                    <a:blip r:embed="rId33"/>
+                    <a:stretch>
+                      <a:fillRect/>
+                    </a:stretch>
+                  </pic:blipFill>
+                  <pic:spPr>
+                    <a:xfrm>
+                      <a:off x="0" y="0"/>
+                      <a:ext cx="5731510" cy="1698625"/>
+                    </a:xfrm>
+                    <a:prstGeom prst="rect">
+                      <a:avLst/>
+                    </a:prstGeom>
+                  </pic:spPr>
+                </pic:pic>
+              </a:graphicData>
+            </a:graphic>
+          </wp:inline>
+        </w:drawing>
+      </w:r>
     </w:p>
     <w:p>
       <w:pPr>

</xml_diff>